<commit_message>
Clarify overhead figures, backstop-flush and float-drift wording in report
</commit_message>
<xml_diff>
--- a/docs/report/Progress_Report_3.docx
+++ b/docs/report/Progress_Report_3.docx
@@ -1482,7 +1482,7 @@
           <w:i w:val="0"/>
           <w:sz w:val="24"/>
         </w:rPr>
-        <w:t>The suite has 426 tests in 12 files: 412 pass and 14 are strict expected failures tied to nine bugs logged in BUGS.md. Statement coverage of seqmon is 96% (823 statements, 33 missed; docs/evidence/coverage.txt), and ruff and strict mypy report no issues. On the scripted suites the monitor detected 11 of 11 adversarial scenarios and 2 of 10 evasion scenarios, with no alert on the 9 benign ones. In experiments/overhead.py, a naive evaluator that rescans the history took 10,491 µs per event at 100,000 events against 3.6 µs for the incremental one. All timings are single uncontrolled runs on one machine.</w:t>
+        <w:t>The suite has 426 tests in 12 files: 412 pass and 14 are strict expected failures tied to nine bugs logged in BUGS.md. Statement coverage of seqmon is 96% (823 statements, 33 missed; docs/evidence/coverage.txt), and ruff and strict mypy report no issues. On the scripted suites the monitor detected 11 of 11 adversarial scenarios and 2 of 10 evasion scenarios, with no alert on the 9 benign ones. In experiments/overhead.py, a naive evaluator that rescans the history took 10,491 µs per event at 100,000 events against 3.6 µs for the incremental one. Figure 1 comes from a separate script, bench/overhead.py, which measures the incremental evaluator alone, hence its slightly lower figures. All timings are single uncontrolled runs on one machine.</w:t>
       </w:r>
     </w:p>
     <w:p>
@@ -1575,7 +1575,7 @@
           <w:i w:val="0"/>
           <w:sz w:val="24"/>
         </w:rPr>
-        <w:t>Eight of the ten evasion scenarios are missed: they stay under thresholds, hop between windows, split across sessions, pace sends or strays just outside a window, or stay under the daily budget, which are limits of fixed-threshold, fixed-window, per-session rules. One, backstop-flush, pads the window with about 1,000 zero-row calls so the 10,000-event cap pushes the damaging events out. This is open; the options (never shed events that carry magnitude, or alert when shedding starts) are in OPEN_QUESTIONS.md.</w:t>
+        <w:t>Eight of the ten evasion scenarios are missed: they stay under thresholds, hop between windows, split across sessions, pace sends or strays just outside a window, or stay under the daily budget, which are limits of fixed-threshold, fixed-window, per-session rules. One, backstop-flush, pads the window with about 1,000 zero-row calls between each real read (12,000 in total) so the 10,000-event cap pushes the damaging events out. This is open; the options (never shed events that carry magnitude, or alert when shedding starts) are in OPEN_QUESTIONS.md.</w:t>
       </w:r>
     </w:p>
     <w:p>
@@ -1629,7 +1629,7 @@
           <w:i w:val="0"/>
           <w:sz w:val="24"/>
         </w:rPr>
-        <w:t>New boundary, property and state-bound tests exposed nine bugs. The most serious, BUG-006, is that a rule needing more events than the per-window cap can never fire, and nothing reports it. BUG-001/002 are floating-point drift in the running sum: 500 charges of $0.10 fire a $50 limit they only reach. Earlier engineering problems are resolved: the parser accepted booleans as numbers (now a SpecError), tests failed outside the repository root (paths now relative to __file__), and macOS hides the venv's editable-install .pth file, so scripts and pytest put src/ on the path.</w:t>
+        <w:t>New boundary, property and state-bound tests exposed nine bugs. The most serious, BUG-006, is that a rule needing more events than the per-window cap can never fire, and nothing reports it. BUG-001/002 are floating-point drift in the running sum: 500 charges of $0.10 add up to 50.00000000000044, so a $50 limit fires even though spending only reaches it. Earlier engineering problems are resolved: the parser accepted booleans as numbers (now a SpecError), tests failed outside the repository root (paths now relative to __file__), and macOS hides the venv's editable-install .pth file, so scripts and pytest put src/ on the path.</w:t>
       </w:r>
     </w:p>
     <w:p>

</xml_diff>

<commit_message>
Show the work in Progress Report 3 with figures
Add an architecture diagram, a step-by-step chart of the demo (per-call
alone vs seqmon, approved and denied escalations), a rendering of the real
test/coverage/lint results, and the detection figure; shorten the prose
these replace. Figures are generated by docs/report/make_figures.py.
</commit_message>
<xml_diff>
--- a/docs/report/Progress_Report_3.docx
+++ b/docs/report/Progress_Report_3.docx
@@ -162,7 +162,68 @@
           <w:i w:val="0"/>
           <w:sz w:val="24"/>
         </w:rPr>
-        <w:t>The runtime is 2,133 lines of Python in src/seqmon/. ToolCallEvent (events.py) carries the action, session, timestamp, resource, a magnitude and named attributes such as records or cost_usd. The state accumulator (state.py) keeps one sliding window per rule per session: a deque of events with a running sum and a per-resource counter, evicted by timestamp. The incremental evaluator (IncrementalEvaluator.on_action in evaluator.py) takes one permitted call, updates the windows of the rules it matches, checks them and returns any violations. The response layer (response.py) maps each violation to LOG, ESCALATE or TERMINATE and calls pluggable EscalationHook and TerminationHook objects; an approved escalation re-arms the rule so the next breach asks again. SequenceMonitor (monitor.py) wraps these components. src/seqmon/adapters/ defines the PerCallEngine and CallFeed interfaces a real AGT hook would implement, a FakePerCallEngine that re-implements AGT's flat YAML evaluation, and a FakeAGTInterceptor that chains it with the monitor.</w:t>
+        <w:t>Figure 1 shows where the 2,133 lines of src/seqmon/ sit. Each call the per-call policy allows becomes a ToolCallEvent (events.py) and goes to IncrementalEvaluator.on_action (evaluator.py), which updates one sliding window per rule per session (state.py) and returns violations. response.py maps them to LOG, ESCALATE or TERMINATE and calls pluggable EscalationHook and TerminationHook objects; an approved escalation re-arms the rule. src/seqmon/adapters/ holds the interfaces a real AGT hook would implement and a FakePerCallEngine that re-implements AGT's flat YAML evaluation.</w:t>
+      </w:r>
+    </w:p>
+    <w:p>
+      <w:pPr>
+        <w:keepNext/>
+        <w:spacing w:after="0"/>
+        <w:jc w:val="center"/>
+      </w:pPr>
+      <w:r>
+        <w:drawing>
+          <wp:inline xmlns:a="http://schemas.openxmlformats.org/drawingml/2006/main" xmlns:pic="http://schemas.openxmlformats.org/drawingml/2006/picture">
+            <wp:extent cx="5486400" cy="2008333"/>
+            <wp:docPr id="1" name="Picture 1"/>
+            <wp:cNvGraphicFramePr>
+              <a:graphicFrameLocks noChangeAspect="1"/>
+            </wp:cNvGraphicFramePr>
+            <a:graphic>
+              <a:graphicData uri="http://schemas.openxmlformats.org/drawingml/2006/picture">
+                <pic:pic>
+                  <pic:nvPicPr>
+                    <pic:cNvPr id="0" name="architecture.png"/>
+                    <pic:cNvPicPr/>
+                  </pic:nvPicPr>
+                  <pic:blipFill>
+                    <a:blip r:embed="rId9"/>
+                    <a:stretch>
+                      <a:fillRect/>
+                    </a:stretch>
+                  </pic:blipFill>
+                  <pic:spPr>
+                    <a:xfrm>
+                      <a:off x="0" y="0"/>
+                      <a:ext cx="5486400" cy="2008333"/>
+                    </a:xfrm>
+                    <a:prstGeom prst="rect"/>
+                  </pic:spPr>
+                </pic:pic>
+              </a:graphicData>
+            </a:graphic>
+          </wp:inline>
+        </w:drawing>
+      </w:r>
+    </w:p>
+    <w:p>
+      <w:pPr>
+        <w:spacing w:before="60" w:after="200"/>
+      </w:pPr>
+      <w:r>
+        <w:rPr>
+          <w:rFonts w:ascii="Times New Roman" w:hAnsi="Times New Roman" w:eastAsia="Times New Roman" w:cs="Times New Roman"/>
+          <w:b/>
+          <w:sz w:val="22"/>
+        </w:rPr>
+        <w:t xml:space="preserve">Figure 1. </w:t>
+      </w:r>
+      <w:r>
+        <w:rPr>
+          <w:rFonts w:ascii="Times New Roman" w:hAnsi="Times New Roman" w:eastAsia="Times New Roman" w:cs="Times New Roman"/>
+          <w:sz w:val="22"/>
+        </w:rPr>
+        <w:t>Where seqmon sits. Only calls the stateless per-call policy allows reach it; it keeps per-session windows and answers each call with LOG, ESCALATE or TERMINATE. In this report the per-call box is simulated by FakePerCallEngine.</w:t>
       </w:r>
     </w:p>
     <w:p>
@@ -180,7 +241,7 @@
           <w:i w:val="0"/>
           <w:sz w:val="24"/>
         </w:rPr>
-        <w:t>Incremental updates: the running sum and the distinct-resource count change only when an event enters or leaves a window, so no check rescans the history and the cost per event depends on the number of rules, not on session length (Figure 1). To check that shortcut, a naive evaluator (bench/naive.py) recomputes every rule from its definition, and property tests compare the incremental evaluator with an independently written reference on random policies and traces. Bounded deque: each window holds only events inside its span, plus a hard cap, max_events_per_window (10,000 by default). I kept a manual cap rather than deque(maxlen=...) because an event dropped by the cap must also be subtracted from the running sum and counted; maxlen would discard it silently. The bound is per session (rules × cap events); across sessions, idle sessions expire only when a clock or a shared time base is configured (Section 4).</w:t>
+        <w:t>Incremental updates: the running sum and the distinct-resource count change only when an event enters or leaves a window, so no check rescans the history and the cost per event depends on the number of rules, not on session length (Figure 4). To check that shortcut, a naive evaluator (bench/naive.py) recomputes every rule from its definition, and property tests compare the incremental evaluator with an independently written reference on random policies and traces. Bounded deque: each window holds only events inside its span, plus a hard cap, max_events_per_window (10,000 by default). I kept a manual cap rather than deque(maxlen=...) because an event dropped by the cap must also be subtracted from the running sum and counted; maxlen would discard it silently. The bound is per session (rules × cap events); across sessions, idle sessions expire only when a clock or a shared time base is configured (Section 4).</w:t>
       </w:r>
     </w:p>
     <w:p>
@@ -1175,7 +1236,68 @@
           <w:i w:val="0"/>
           <w:sz w:val="24"/>
         </w:rPr>
-        <w:t>Listing 3 is the demo. A 32-call synthetic slow-exfiltration trace runs through FakeAGTInterceptor with one combined policy file. Its per-call rule denies any single query over 1,000 rows, but the agent pages 400 rows at a time, so every call is allowed. The scope rule escalates at step 7, and the cumulative rule terminates the session at step 17 after 5,260 rows; the other 15 calls, including the external send, are refused. Without the sequence layer all 32 calls run (10,860 rows). The demo has no human approver, so its 10 escalations are auto-approved, and it says so. Simulated comparison: the per-call verdicts in this demo come from FakePerCallEngine, my re-implementation of AGT's flat YAML evaluation, not from the AGT toolkit itself. It agreed with AGT's real PolicyEvaluator on all 36 calls I compared, but only 4 of those matched a rule, so the per-call side should be read as simulated.</w:t>
+        <w:t>Figure 2 is the demo. A 32-call synthetic slow-exfiltration trace runs through FakeAGTInterceptor with one combined policy file. Its per-call rule denies any single query over 1,000 rows, but the agent pages 400 rows at a time, so every call is allowed. The scope rule escalates at step 7, and the cumulative rule terminates the session at step 17 after 5,260 rows; the other 15 calls, including the external send, are refused. Without the sequence layer all 32 calls run (10,860 rows). The demo has no human approver, so its 10 escalations are auto-approved, and it says so. Simulated comparison: the per-call verdicts in this demo come from FakePerCallEngine, my re-implementation of AGT's flat YAML evaluation, not from the AGT toolkit itself. It agreed with AGT's real PolicyEvaluator on all 36 calls I compared, but only 4 of those matched a rule, so the per-call side should be read as simulated.</w:t>
+      </w:r>
+    </w:p>
+    <w:p>
+      <w:pPr>
+        <w:keepNext/>
+        <w:spacing w:after="0"/>
+        <w:jc w:val="center"/>
+      </w:pPr>
+      <w:r>
+        <w:drawing>
+          <wp:inline xmlns:a="http://schemas.openxmlformats.org/drawingml/2006/main" xmlns:pic="http://schemas.openxmlformats.org/drawingml/2006/picture">
+            <wp:extent cx="5486400" cy="2852928"/>
+            <wp:docPr id="2" name="Picture 2"/>
+            <wp:cNvGraphicFramePr>
+              <a:graphicFrameLocks noChangeAspect="1"/>
+            </wp:cNvGraphicFramePr>
+            <a:graphic>
+              <a:graphicData uri="http://schemas.openxmlformats.org/drawingml/2006/picture">
+                <pic:pic>
+                  <pic:nvPicPr>
+                    <pic:cNvPr id="0" name="demo_timeline.png"/>
+                    <pic:cNvPicPr/>
+                  </pic:nvPicPr>
+                  <pic:blipFill>
+                    <a:blip r:embed="rId10"/>
+                    <a:stretch>
+                      <a:fillRect/>
+                    </a:stretch>
+                  </pic:blipFill>
+                  <pic:spPr>
+                    <a:xfrm>
+                      <a:off x="0" y="0"/>
+                      <a:ext cx="5486400" cy="2852928"/>
+                    </a:xfrm>
+                    <a:prstGeom prst="rect"/>
+                  </pic:spPr>
+                </pic:pic>
+              </a:graphicData>
+            </a:graphic>
+          </wp:inline>
+        </w:drawing>
+      </w:r>
+    </w:p>
+    <w:p>
+      <w:pPr>
+        <w:spacing w:before="60" w:after="200"/>
+      </w:pPr>
+      <w:r>
+        <w:rPr>
+          <w:rFonts w:ascii="Times New Roman" w:hAnsi="Times New Roman" w:eastAsia="Times New Roman" w:cs="Times New Roman"/>
+          <w:b/>
+          <w:sz w:val="22"/>
+        </w:rPr>
+        <w:t xml:space="preserve">Figure 2. </w:t>
+      </w:r>
+      <w:r>
+        <w:rPr>
+          <w:rFonts w:ascii="Times New Roman" w:hAnsi="Times New Roman" w:eastAsia="Times New Roman" w:cs="Times New Roman"/>
+          <w:sz w:val="22"/>
+        </w:rPr>
+        <w:t>Customer rows read at each step of scripts/demo_trace.py, computed by replaying the same trace three ways. Grey: per-call engine alone. Blue: with seqmon, escalations approved, so the cumulative rule terminates at step 17. Orange: with seqmon and the step-7 escalation denied (--deny-escalations), so the session stops there.</w:t>
       </w:r>
     </w:p>
     <w:p>
@@ -1196,7 +1318,7 @@
           <w:rFonts w:ascii="Times New Roman" w:hAnsi="Times New Roman" w:eastAsia="Times New Roman" w:cs="Times New Roman"/>
           <w:sz w:val="22"/>
         </w:rPr>
-        <w:t>Excerpt of docs/evidence/demo_output.txt (rows omitted, column padding reduced, long lines wrapped).</w:t>
+        <w:t>Summary lines of docs/evidence/demo_output.txt.</w:t>
       </w:r>
     </w:p>
     <w:tbl>
@@ -1234,9 +1356,9 @@
             <w:r>
               <w:rPr>
                 <w:rFonts w:ascii="Courier New" w:hAnsi="Courier New" w:eastAsia="Courier New" w:cs="Courier New"/>
-                <w:sz w:val="14"/>
+                <w:sz w:val="15"/>
               </w:rPr>
-              <w:t>step per-call action                  resource                    rows cum.rows sequence monitor</w:t>
+              <w:t>Per-call engine alone (no sequence layer): 32 of 32 calls allowed -&gt; 10,860 rows read, external</w:t>
             </w:r>
           </w:p>
           <w:p>
@@ -1247,9 +1369,9 @@
             <w:r>
               <w:rPr>
                 <w:rFonts w:ascii="Courier New" w:hAnsi="Courier New" w:eastAsia="Courier New" w:cs="Courier New"/>
-                <w:sz w:val="14"/>
+                <w:sz w:val="15"/>
               </w:rPr>
-              <w:t xml:space="preserve">   1 allow    customer_db.query       customer_db.orders           120      120 ok</w:t>
+              <w:t xml:space="preserve">    send runs</w:t>
             </w:r>
           </w:p>
           <w:p>
@@ -1260,9 +1382,9 @@
             <w:r>
               <w:rPr>
                 <w:rFonts w:ascii="Courier New" w:hAnsi="Courier New" w:eastAsia="Courier New" w:cs="Courier New"/>
-                <w:sz w:val="14"/>
+                <w:sz w:val="15"/>
               </w:rPr>
-              <w:t xml:space="preserve"> ...  (steps 2-5 omitted)</w:t>
+              <w:t>Sequence violation fired at step 7: resource-scope-drift [ESCALATE] observed 4 &gt; threshold 3 after</w:t>
             </w:r>
           </w:p>
           <w:p>
@@ -1273,9 +1395,9 @@
             <w:r>
               <w:rPr>
                 <w:rFonts w:ascii="Courier New" w:hAnsi="Courier New" w:eastAsia="Courier New" w:cs="Courier New"/>
-                <w:sz w:val="14"/>
+                <w:sz w:val="15"/>
               </w:rPr>
-              <w:t xml:space="preserve">   6 allow    customer_db.query       customer_db.payment_methods  200     1060 ok</w:t>
+              <w:t xml:space="preserve">    7 events</w:t>
             </w:r>
           </w:p>
           <w:p>
@@ -1286,9 +1408,9 @@
             <w:r>
               <w:rPr>
                 <w:rFonts w:ascii="Courier New" w:hAnsi="Courier New" w:eastAsia="Courier New" w:cs="Courier New"/>
-                <w:sz w:val="14"/>
+                <w:sz w:val="15"/>
               </w:rPr>
-              <w:t xml:space="preserve">   7 allow    customer_db.query       customer_db.support_tickets  200     1260 ESCALATE:resource-scope-drift</w:t>
+              <w:t>Sequence violation fired at step 17: bulk-customer-read [TERMINATE] observed 5260 &gt; threshold 5000</w:t>
             </w:r>
           </w:p>
           <w:p>
@@ -1299,152 +1421,9 @@
             <w:r>
               <w:rPr>
                 <w:rFonts w:ascii="Courier New" w:hAnsi="Courier New" w:eastAsia="Courier New" w:cs="Courier New"/>
-                <w:sz w:val="14"/>
+                <w:sz w:val="15"/>
               </w:rPr>
-              <w:t xml:space="preserve"> ...  (steps 8-16 omitted; ESCALATE:resource-scope-drift on each)</w:t>
-            </w:r>
-          </w:p>
-          <w:p>
-            <w:pPr>
-              <w:keepNext/>
-              <w:spacing w:after="0" w:before="0" w:line="240" w:lineRule="auto"/>
-            </w:pPr>
-            <w:r>
-              <w:rPr>
-                <w:rFonts w:ascii="Courier New" w:hAnsi="Courier New" w:eastAsia="Courier New" w:cs="Courier New"/>
-                <w:sz w:val="14"/>
-              </w:rPr>
-              <w:t xml:space="preserve">  17 allow    customer_db.query       customer_db.customers        400     5260 TERMINATE:bulk-customer-read,</w:t>
-            </w:r>
-          </w:p>
-          <w:p>
-            <w:pPr>
-              <w:keepNext/>
-              <w:spacing w:after="0" w:before="0" w:line="240" w:lineRule="auto"/>
-            </w:pPr>
-            <w:r>
-              <w:rPr>
-                <w:rFonts w:ascii="Courier New" w:hAnsi="Courier New" w:eastAsia="Courier New" w:cs="Courier New"/>
-                <w:sz w:val="14"/>
-              </w:rPr>
-              <w:t xml:space="preserve">                                                                                ESCALATE:resource-scope-drift</w:t>
-            </w:r>
-          </w:p>
-          <w:p>
-            <w:pPr>
-              <w:keepNext/>
-              <w:spacing w:after="0" w:before="0" w:line="240" w:lineRule="auto"/>
-            </w:pPr>
-            <w:r>
-              <w:rPr>
-                <w:rFonts w:ascii="Courier New" w:hAnsi="Courier New" w:eastAsia="Courier New" w:cs="Courier New"/>
-                <w:sz w:val="14"/>
-              </w:rPr>
-              <w:t xml:space="preserve">  18 -        customer_db.query       customer_db.customers        400     5260 refused (session terminated)</w:t>
-            </w:r>
-          </w:p>
-          <w:p>
-            <w:pPr>
-              <w:keepNext/>
-              <w:spacing w:after="0" w:before="0" w:line="240" w:lineRule="auto"/>
-            </w:pPr>
-            <w:r>
-              <w:rPr>
-                <w:rFonts w:ascii="Courier New" w:hAnsi="Courier New" w:eastAsia="Courier New" w:cs="Courier New"/>
-                <w:sz w:val="14"/>
-              </w:rPr>
-              <w:t xml:space="preserve"> ...  (13 more calls refused: session terminated)</w:t>
-            </w:r>
-          </w:p>
-          <w:p>
-            <w:pPr>
-              <w:keepNext/>
-              <w:spacing w:after="0" w:before="0" w:line="240" w:lineRule="auto"/>
-            </w:pPr>
-            <w:r>
-              <w:rPr>
-                <w:rFonts w:ascii="Courier New" w:hAnsi="Courier New" w:eastAsia="Courier New" w:cs="Courier New"/>
-                <w:sz w:val="14"/>
-              </w:rPr>
-              <w:t xml:space="preserve">  32 -        messaging.send_external smtp/external                  0     5260 refused (session terminated)</w:t>
-            </w:r>
-          </w:p>
-          <w:p>
-            <w:pPr>
-              <w:keepNext/>
-              <w:spacing w:after="0" w:before="0" w:line="240" w:lineRule="auto"/>
-            </w:pPr>
-            <w:r>
-              <w:rPr>
-                <w:rFonts w:ascii="Courier New" w:hAnsi="Courier New" w:eastAsia="Courier New" w:cs="Courier New"/>
-                <w:sz w:val="14"/>
-              </w:rPr>
-              <w:t xml:space="preserve"> </w:t>
-            </w:r>
-          </w:p>
-          <w:p>
-            <w:pPr>
-              <w:keepNext/>
-              <w:spacing w:after="0" w:before="0" w:line="240" w:lineRule="auto"/>
-            </w:pPr>
-            <w:r>
-              <w:rPr>
-                <w:rFonts w:ascii="Courier New" w:hAnsi="Courier New" w:eastAsia="Courier New" w:cs="Courier New"/>
-                <w:sz w:val="14"/>
-              </w:rPr>
-              <w:t>Per-call engine alone (no sequence layer): 32 of 32 calls allowed -&gt; 10,860 rows read, external send runs</w:t>
-            </w:r>
-          </w:p>
-          <w:p>
-            <w:pPr>
-              <w:keepNext/>
-              <w:spacing w:after="0" w:before="0" w:line="240" w:lineRule="auto"/>
-            </w:pPr>
-            <w:r>
-              <w:rPr>
-                <w:rFonts w:ascii="Courier New" w:hAnsi="Courier New" w:eastAsia="Courier New" w:cs="Courier New"/>
-                <w:sz w:val="14"/>
-              </w:rPr>
-              <w:t>Sequence violation fired at step 7: resource-scope-drift [ESCALATE] observed 4 &gt; threshold 3 after 7</w:t>
-            </w:r>
-          </w:p>
-          <w:p>
-            <w:pPr>
-              <w:keepNext/>
-              <w:spacing w:after="0" w:before="0" w:line="240" w:lineRule="auto"/>
-            </w:pPr>
-            <w:r>
-              <w:rPr>
-                <w:rFonts w:ascii="Courier New" w:hAnsi="Courier New" w:eastAsia="Courier New" w:cs="Courier New"/>
-                <w:sz w:val="14"/>
-              </w:rPr>
-              <w:t xml:space="preserve">    events</w:t>
-            </w:r>
-          </w:p>
-          <w:p>
-            <w:pPr>
-              <w:keepNext/>
-              <w:spacing w:after="0" w:before="0" w:line="240" w:lineRule="auto"/>
-            </w:pPr>
-            <w:r>
-              <w:rPr>
-                <w:rFonts w:ascii="Courier New" w:hAnsi="Courier New" w:eastAsia="Courier New" w:cs="Courier New"/>
-                <w:sz w:val="14"/>
-              </w:rPr>
-              <w:t>Sequence violation fired at step 17: bulk-customer-read [TERMINATE] observed 5260 &gt; threshold 5000 after</w:t>
-            </w:r>
-          </w:p>
-          <w:p>
-            <w:pPr>
-              <w:keepNext/>
-              <w:spacing w:after="0" w:before="0" w:line="240" w:lineRule="auto"/>
-            </w:pPr>
-            <w:r>
-              <w:rPr>
-                <w:rFonts w:ascii="Courier New" w:hAnsi="Courier New" w:eastAsia="Courier New" w:cs="Courier New"/>
-                <w:sz w:val="14"/>
-              </w:rPr>
-              <w:t xml:space="preserve">    17 events</w:t>
+              <w:t xml:space="preserve">    after 17 events</w:t>
             </w:r>
           </w:p>
           <w:p>
@@ -1454,7 +1433,7 @@
             <w:r>
               <w:rPr>
                 <w:rFonts w:ascii="Courier New" w:hAnsi="Courier New" w:eastAsia="Courier New" w:cs="Courier New"/>
-                <w:sz w:val="14"/>
+                <w:sz w:val="15"/>
               </w:rPr>
               <w:t>Session terminated at step 17; 15 later call(s) refused, including the external send.</w:t>
             </w:r>
@@ -1482,7 +1461,7 @@
           <w:i w:val="0"/>
           <w:sz w:val="24"/>
         </w:rPr>
-        <w:t>The suite has 426 tests in 12 files: 412 pass and 14 are strict expected failures tied to nine bugs logged in BUGS.md. Statement coverage of seqmon is 96% (823 statements, 33 missed; docs/evidence/coverage.txt), and ruff and strict mypy report no issues. On the scripted suites the monitor detected 11 of 11 adversarial scenarios and 2 of 10 evasion scenarios, with no alert on the 9 benign ones. In experiments/overhead.py, a naive evaluator that rescans the history took 10,491 µs per event at 100,000 events against 3.6 µs for the incremental one. Figure 1 comes from a separate script, bench/overhead.py, which measures the incremental evaluator alone, hence its slightly lower figures. All timings are single uncontrolled runs on one machine.</w:t>
+        <w:t>Figure 3 is the test run: 426 tests in 12 files, of which 412 pass and 14 are strict expected failures tied to nine bugs logged in BUGS.md, with 96% statement coverage and clean ruff and strict mypy checks. On the scripted suites the monitor detected 11 of 11 adversarial scenarios and 2 of 10 evasion scenarios, with no alert on the 9 benign ones (Figure 5). In experiments/overhead.py, a naive evaluator that rescans the history took 10,491 µs per event at 100,000 events against 3.6 µs for the incremental one. Figure 4 comes from a separate script, bench/overhead.py, which measures the incremental evaluator alone, hence its slightly lower figures. All timings are single uncontrolled runs on one machine.</w:t>
       </w:r>
     </w:p>
     <w:p>
@@ -1494,8 +1473,8 @@
       <w:r>
         <w:drawing>
           <wp:inline xmlns:a="http://schemas.openxmlformats.org/drawingml/2006/main" xmlns:pic="http://schemas.openxmlformats.org/drawingml/2006/picture">
-            <wp:extent cx="4754880" cy="1901952"/>
-            <wp:docPr id="1" name="Picture 1"/>
+            <wp:extent cx="4572000" cy="2871669"/>
+            <wp:docPr id="3" name="Picture 3"/>
             <wp:cNvGraphicFramePr>
               <a:graphicFrameLocks noChangeAspect="1"/>
             </wp:cNvGraphicFramePr>
@@ -1503,11 +1482,11 @@
               <a:graphicData uri="http://schemas.openxmlformats.org/drawingml/2006/picture">
                 <pic:pic>
                   <pic:nvPicPr>
-                    <pic:cNvPr id="0" name="overhead.png"/>
+                    <pic:cNvPr id="0" name="test_evidence.png"/>
                     <pic:cNvPicPr/>
                   </pic:nvPicPr>
                   <pic:blipFill>
-                    <a:blip r:embed="rId9"/>
+                    <a:blip r:embed="rId11"/>
                     <a:stretch>
                       <a:fillRect/>
                     </a:stretch>
@@ -1515,7 +1494,7 @@
                   <pic:spPr>
                     <a:xfrm>
                       <a:off x="0" y="0"/>
-                      <a:ext cx="4754880" cy="1901952"/>
+                      <a:ext cx="4572000" cy="2871669"/>
                     </a:xfrm>
                     <a:prstGeom prst="rect"/>
                   </pic:spPr>
@@ -1536,7 +1515,68 @@
           <w:b/>
           <w:sz w:val="22"/>
         </w:rPr>
-        <w:t xml:space="preserve">Figure 1. </w:t>
+        <w:t xml:space="preserve">Figure 3. </w:t>
+      </w:r>
+      <w:r>
+        <w:rPr>
+          <w:rFonts w:ascii="Times New Roman" w:hAnsi="Times New Roman" w:eastAsia="Times New Roman" w:cs="Times New Roman"/>
+          <w:sz w:val="22"/>
+        </w:rPr>
+        <w:t>Test, coverage and lint results (pytest and coverage lines from docs/evidence/test_run.txt and coverage.txt; ruff and mypy run when the figure was built).</w:t>
+      </w:r>
+    </w:p>
+    <w:p>
+      <w:pPr>
+        <w:keepNext/>
+        <w:spacing w:after="0"/>
+        <w:jc w:val="center"/>
+      </w:pPr>
+      <w:r>
+        <w:drawing>
+          <wp:inline xmlns:a="http://schemas.openxmlformats.org/drawingml/2006/main" xmlns:pic="http://schemas.openxmlformats.org/drawingml/2006/picture">
+            <wp:extent cx="5029200" cy="2011680"/>
+            <wp:docPr id="4" name="Picture 4"/>
+            <wp:cNvGraphicFramePr>
+              <a:graphicFrameLocks noChangeAspect="1"/>
+            </wp:cNvGraphicFramePr>
+            <a:graphic>
+              <a:graphicData uri="http://schemas.openxmlformats.org/drawingml/2006/picture">
+                <pic:pic>
+                  <pic:nvPicPr>
+                    <pic:cNvPr id="0" name="overhead.png"/>
+                    <pic:cNvPicPr/>
+                  </pic:nvPicPr>
+                  <pic:blipFill>
+                    <a:blip r:embed="rId12"/>
+                    <a:stretch>
+                      <a:fillRect/>
+                    </a:stretch>
+                  </pic:blipFill>
+                  <pic:spPr>
+                    <a:xfrm>
+                      <a:off x="0" y="0"/>
+                      <a:ext cx="5029200" cy="2011680"/>
+                    </a:xfrm>
+                    <a:prstGeom prst="rect"/>
+                  </pic:spPr>
+                </pic:pic>
+              </a:graphicData>
+            </a:graphic>
+          </wp:inline>
+        </w:drawing>
+      </w:r>
+    </w:p>
+    <w:p>
+      <w:pPr>
+        <w:spacing w:before="60" w:after="200"/>
+      </w:pPr>
+      <w:r>
+        <w:rPr>
+          <w:rFonts w:ascii="Times New Roman" w:hAnsi="Times New Roman" w:eastAsia="Times New Roman" w:cs="Times New Roman"/>
+          <w:b/>
+          <w:sz w:val="22"/>
+        </w:rPr>
+        <w:t xml:space="preserve">Figure 4. </w:t>
       </w:r>
       <w:r>
         <w:rPr>
@@ -1544,6 +1584,67 @@
           <w:sz w:val="22"/>
         </w:rPr>
         <w:t>Monitor overhead against session length (bench/overhead.py; 6-rule example policy, 1 event/s, Apple M1, CPython 3.12.7). Left: evaluation time stays between 2.3 and 2.6 µs per event from 100 to 100,000 events. Right: memory reaches 3,369 KiB because the policy's one-day window has not yet filled; the 12,050 retained events are within the 6 × 10,000 bound.</w:t>
+      </w:r>
+    </w:p>
+    <w:p>
+      <w:pPr>
+        <w:keepNext/>
+        <w:spacing w:after="0"/>
+        <w:jc w:val="center"/>
+      </w:pPr>
+      <w:r>
+        <w:drawing>
+          <wp:inline xmlns:a="http://schemas.openxmlformats.org/drawingml/2006/main" xmlns:pic="http://schemas.openxmlformats.org/drawingml/2006/picture">
+            <wp:extent cx="5029200" cy="2992284"/>
+            <wp:docPr id="5" name="Picture 5"/>
+            <wp:cNvGraphicFramePr>
+              <a:graphicFrameLocks noChangeAspect="1"/>
+            </wp:cNvGraphicFramePr>
+            <a:graphic>
+              <a:graphicData uri="http://schemas.openxmlformats.org/drawingml/2006/picture">
+                <pic:pic>
+                  <pic:nvPicPr>
+                    <pic:cNvPr id="0" name="detection.png"/>
+                    <pic:cNvPicPr/>
+                  </pic:nvPicPr>
+                  <pic:blipFill>
+                    <a:blip r:embed="rId13"/>
+                    <a:stretch>
+                      <a:fillRect/>
+                    </a:stretch>
+                  </pic:blipFill>
+                  <pic:spPr>
+                    <a:xfrm>
+                      <a:off x="0" y="0"/>
+                      <a:ext cx="5029200" cy="2992284"/>
+                    </a:xfrm>
+                    <a:prstGeom prst="rect"/>
+                  </pic:spPr>
+                </pic:pic>
+              </a:graphicData>
+            </a:graphic>
+          </wp:inline>
+        </w:drawing>
+      </w:r>
+    </w:p>
+    <w:p>
+      <w:pPr>
+        <w:spacing w:before="60" w:after="200"/>
+      </w:pPr>
+      <w:r>
+        <w:rPr>
+          <w:rFonts w:ascii="Times New Roman" w:hAnsi="Times New Roman" w:eastAsia="Times New Roman" w:cs="Times New Roman"/>
+          <w:b/>
+          <w:sz w:val="22"/>
+        </w:rPr>
+        <w:t xml:space="preserve">Figure 5. </w:t>
+      </w:r>
+      <w:r>
+        <w:rPr>
+          <w:rFonts w:ascii="Times New Roman" w:hAnsi="Times New Roman" w:eastAsia="Times New Roman" w:cs="Times New Roman"/>
+          <w:sz w:val="22"/>
+        </w:rPr>
+        <w:t>Detection on the 30 scripted scenarios (experiments/detection.py). Blue: detected by any rule; orange: detected first by the rule the scenario targets.</w:t>
       </w:r>
     </w:p>
     <w:p>

</xml_diff>